<commit_message>
PF: added Wally that changes colors; positioned canvas to center on window; added my name; updated font sizes for description; changed css bg color; changed table of contents box color
</commit_message>
<xml_diff>
--- a/Resources used.docx
+++ b/Resources used.docx
@@ -79,6 +79,51 @@
           </wp:inline>
         </w:drawing>
       </w:r>
+    </w:p>
+    <w:p/>
+    <w:p>
+      <w:pPr>
+        <w:rPr>
+          <w:b/>
+          <w:bCs/>
+        </w:rPr>
+      </w:pPr>
+      <w:r>
+        <w:rPr>
+          <w:b/>
+          <w:bCs/>
+        </w:rPr>
+        <w:t>Positioning my canvas:</w:t>
+      </w:r>
+    </w:p>
+    <w:p>
+      <w:hyperlink r:id="rId6" w:history="1">
+        <w:r>
+          <w:rPr>
+            <w:rStyle w:val="Hyperlink"/>
+          </w:rPr>
+          <w:t>https://github.com/processing/p5.js/wiki/Positioning-your-canvas</w:t>
+        </w:r>
+      </w:hyperlink>
+    </w:p>
+    <w:p/>
+    <w:p>
+      <w:r>
+        <w:t>Change cursor to custom image:</w:t>
+      </w:r>
+    </w:p>
+    <w:p>
+      <w:hyperlink r:id="rId7" w:history="1">
+        <w:r>
+          <w:rPr>
+            <w:rStyle w:val="Hyperlink"/>
+          </w:rPr>
+          <w:t>https://css-tricks.com/using-css-cursors/</w:t>
+        </w:r>
+      </w:hyperlink>
+    </w:p>
+    <w:p/>
+    <w:p>
       <w:bookmarkStart w:id="0" w:name="_GoBack"/>
       <w:bookmarkEnd w:id="0"/>
     </w:p>
@@ -215,6 +260,7 @@
     <w:lsdException w:name="HTML Sample" w:semiHidden="1" w:unhideWhenUsed="1"/>
     <w:lsdException w:name="HTML Typewriter" w:semiHidden="1" w:unhideWhenUsed="1"/>
     <w:lsdException w:name="HTML Variable" w:semiHidden="1" w:unhideWhenUsed="1"/>
+    <w:lsdException w:name="Normal Table" w:semiHidden="1" w:unhideWhenUsed="1"/>
     <w:lsdException w:name="annotation subject" w:semiHidden="1" w:unhideWhenUsed="1"/>
     <w:lsdException w:name="No List" w:semiHidden="1" w:unhideWhenUsed="1"/>
     <w:lsdException w:name="Outline List 1" w:semiHidden="1" w:unhideWhenUsed="1"/>
@@ -261,8 +307,10 @@
     <w:lsdException w:name="Table Subtle 2" w:semiHidden="1" w:unhideWhenUsed="1"/>
     <w:lsdException w:name="Table Web 1" w:semiHidden="1" w:unhideWhenUsed="1"/>
     <w:lsdException w:name="Table Web 2" w:semiHidden="1" w:unhideWhenUsed="1"/>
+    <w:lsdException w:name="Table Web 3" w:semiHidden="1" w:unhideWhenUsed="1"/>
     <w:lsdException w:name="Balloon Text" w:semiHidden="1" w:unhideWhenUsed="1"/>
     <w:lsdException w:name="Table Grid" w:uiPriority="39"/>
+    <w:lsdException w:name="Table Theme" w:semiHidden="1" w:unhideWhenUsed="1"/>
     <w:lsdException w:name="Placeholder Text" w:semiHidden="1"/>
     <w:lsdException w:name="No Spacing" w:uiPriority="1" w:qFormat="1"/>
     <w:lsdException w:name="Light Shading" w:uiPriority="60"/>

</xml_diff>

<commit_message>
PF: adjusted speed of whale fountain animation; started creating best-practices.html page (got hero elements in html); attempted to create sparks from unicorn horn
</commit_message>
<xml_diff>
--- a/Resources used.docx
+++ b/Resources used.docx
@@ -119,6 +119,38 @@
             <w:rStyle w:val="Hyperlink"/>
           </w:rPr>
           <w:t>https://css-tricks.com/using-css-cursors/</w:t>
+        </w:r>
+      </w:hyperlink>
+    </w:p>
+    <w:p/>
+    <w:p>
+      <w:r>
+        <w:t>Adding a favicon:</w:t>
+      </w:r>
+    </w:p>
+    <w:p>
+      <w:hyperlink r:id="rId8" w:history="1">
+        <w:r>
+          <w:rPr>
+            <w:rStyle w:val="Hyperlink"/>
+          </w:rPr>
+          <w:t>https://www.w3schools.com/tags/att_link_sizes.asp</w:t>
+        </w:r>
+      </w:hyperlink>
+    </w:p>
+    <w:p/>
+    <w:p>
+      <w:r>
+        <w:t>Set different backgrounds for html pages:</w:t>
+      </w:r>
+    </w:p>
+    <w:p>
+      <w:hyperlink r:id="rId9" w:history="1">
+        <w:r>
+          <w:rPr>
+            <w:rStyle w:val="Hyperlink"/>
+          </w:rPr>
+          <w:t>https://css-tricks.com/forums/topic/different-background-images-on-each-page-3/</w:t>
         </w:r>
       </w:hyperlink>
     </w:p>

</xml_diff>